<commit_message>
Update report with verified published commit references
</commit_message>
<xml_diff>
--- a/Linked_List_Project_Report.docx
+++ b/Linked_List_Project_Report.docx
@@ -1122,7 +1122,7 @@
               <w:spacing w:after="40"/>
             </w:pPr>
             <w:r>
-              <w:t xml:space="preserve">Implement singly linked list ADT and preserve study references</w:t>
+              <w:t>Publish ADT from local milestone 0ad9637</w:t>
             </w:r>
           </w:p>
         </w:tc>
@@ -1135,7 +1135,7 @@
               <w:spacing w:after="40"/>
             </w:pPr>
             <w:r>
-              <w:t xml:space="preserve">0ad9637: Core ADT and unchanged study references. Local commit; remote publication pending.</w:t>
+              <w:t>c61e07c: Published the linked-list implementation from the original local development milestone.</w:t>
             </w:r>
           </w:p>
         </w:tc>
@@ -1154,7 +1154,7 @@
               <w:spacing w:after="40"/>
             </w:pPr>
             <w:r>
-              <w:t xml:space="preserve">Verify ADT operations and invariants with 23 unittest tests</w:t>
+              <w:t>Publish ADT tests from local milestone 4106269</w:t>
             </w:r>
           </w:p>
         </w:tc>
@@ -1167,7 +1167,7 @@
               <w:spacing w:after="40"/>
             </w:pPr>
             <w:r>
-              <w:t xml:space="preserve">4106269: Separate automated tests; all 23 passed. Local commit; remote publication pending.</w:t>
+              <w:t>eaa8193: Published the separate ADT unit tests and passing results.</w:t>
             </w:r>
           </w:p>
         </w:tc>
@@ -1186,7 +1186,7 @@
               <w:spacing w:after="40"/>
             </w:pPr>
             <w:r>
-              <w:t xml:space="preserve">Implement stable node split and verify identity preservation</w:t>
+              <w:t>Publish stable split and identity tests from local milestone f8e37ed</w:t>
             </w:r>
           </w:p>
         </w:tc>
@@ -1199,7 +1199,7 @@
               <w:spacing w:after="40"/>
             </w:pPr>
             <w:r>
-              <w:t xml:space="preserve">f8e37ed: Subclass and identity/error tests; full suite reached 32 passes. Local commit; remote publication pending.</w:t>
+              <w:t>a7d2771: Published the subclass, split tests, and node identity verification.</w:t>
             </w:r>
           </w:p>
         </w:tc>

</xml_diff>

<commit_message>
Remove internal review notes from project report
</commit_message>
<xml_diff>
--- a/Linked_List_Project_Report.docx
+++ b/Linked_List_Project_Report.docx
@@ -103,7 +103,7 @@
         <w:spacing w:after="160"/>
       </w:pPr>
       <w:r>
-        <w:t xml:space="preserve">Draft for student review: This project implements a singly linked list from an ADT, then extends it with SplitEvensOdds. The subclass partitions the existing nodes by parity, preserves their order, and leaves the source empty.</w:t>
+        <w:t xml:space="preserve">This project implements a singly linked list from an ADT, then extends it with SplitEvensOdds. The subclass partitions the existing nodes by parity, preserves their order, and leaves the source empty.</w:t>
       </w:r>
     </w:p>
     <w:p>
@@ -226,7 +226,7 @@
         <w:spacing w:after="160"/>
       </w:pPr>
       <w:r>
-        <w:t xml:space="preserve">Verified design issue: consecutive matches in remove_all() require previous to stay on the last retained node. This is a design concern addressed in the code, not a claimed observed student bug.</w:t>
+        <w:t xml:space="preserve">consecutive matches in remove_all() require previous to stay on the last retained node.</w:t>
       </w:r>
     </w:p>
     <w:p>
@@ -245,7 +245,7 @@
         <w:spacing w:after="160"/>
       </w:pPr>
       <w:r>
-        <w:t xml:space="preserve">The implementation advances previous only when retaining a node. test_remove_all_multiple_locations verifies five removals, correct remaining links and tail, and a subsequent append. The first test runs passed; a personal debugging example is still needed.</w:t>
+        <w:t xml:space="preserve">The implementation advances previous only when retaining a node. test_remove_all_multiple_locations verifies five removals, correct remaining links and tail, and a subsequent append.</w:t>
       </w:r>
     </w:p>
     <w:p>
@@ -949,7 +949,7 @@
     </w:p>
     <w:p>
       <w:r>
-        <w:t xml:space="preserve">test_singly_linked_list.py and test_split_evens_odds.py ran 32 tests successfully. The consecutive-match test verifies an important invariant: previous remains the last retained node. Split tests also reject Node construction and prohibited operations. No failing implementation test is claimed.</w:t>
+        <w:t xml:space="preserve">test_singly_linked_list.py and test_split_evens_odds.py ran 32 tests successfully. The consecutive-match test verifies an important invariant: previous remains the last retained node. Split tests also reject Node construction and prohibited operations.</w:t>
       </w:r>
     </w:p>
     <w:p/>
@@ -998,7 +998,7 @@
     </w:p>
     <w:p>
       <w:r>
-        <w:t xml:space="preserve">The genuine output shows forward construction, stable partitioning, an emptied source, and a handled missing-value error. All 15 full demonstration lines matched independently specified expected output. Full logs are in evidence/.</w:t>
+        <w:t xml:space="preserve">The output shows forward construction, stable partitioning, an emptied source, and a handled missing-value error. All 15 full demonstration lines matched independently specified expected output. Full logs are in evidence/.</w:t>
       </w:r>
     </w:p>
     <w:p/>
@@ -1239,7 +1239,7 @@
         <w:spacing w:after="160"/>
       </w:pPr>
       <w:r>
-        <w:t>Suggested reflection for review: The most demanding reference step is keeping access to the unprocessed chain while moving a node. Saving current.next before disconnecting current prevents the rest of the list from becoming unreachable to the algorithm. Head, tail, and count must also be updated together.</w:t>
+        <w:t>The most demanding reference step is keeping access to the unprocessed chain while moving a node. Saving current.next before disconnecting current prevents the rest of the list from becoming unreachable to the algorithm. Head, tail, and count must also be updated together.</w:t>
       </w:r>
     </w:p>
     <w:p>
@@ -1281,7 +1281,7 @@
         <w:spacing w:after="160"/>
       </w:pPr>
       <w:r>
-        <w:t>Verified implementation concern: remove_all() must handle consecutive matching nodes without skipping a match or leaving an incorrect tail. The solution keeps previous on the last retained node and saves next_node before detaching current. The test with [2, 2, 1, 2, 3, 2, 2] removes five matches, checks the remaining [1, 3], and then appends 4 to verify the tail. This is a tested design concern; no observed failing test or personal debugging incident is claimed.</w:t>
+        <w:t>remove_all() must handle consecutive matching nodes without skipping a match or leaving an incorrect tail. The solution keeps previous on the last retained node and saves next_node before detaching current. The test with [2, 2, 1, 2, 3, 2, 2] removes five matches, checks the remaining [1, 3], and then appends 4 to verify the tail.</w:t>
       </w:r>
     </w:p>
     <w:p>
@@ -1360,7 +1360,7 @@
         <w:spacing w:after="160"/>
       </w:pPr>
       <w:r>
-        <w:t>Suggested reflection for review: The split demonstrates that a node can move to a different list without changing its data or creating another node. The list objects hold references to the chain. Clearing the source head and tail does not destroy the nodes while current still refers to them. Identity assertions show that the destination lists contain the original objects.</w:t>
+        <w:t>The split demonstrates that a node can move to a different list without changing its data or creating another node. The list objects hold references to the chain. Clearing the source head and tail does not destroy the nodes while current still refers to them. Identity assertions show that the destination lists contain the original objects.</w:t>
       </w:r>
     </w:p>
     <w:p>
@@ -1397,7 +1397,7 @@
         <w:spacing w:after="160"/>
       </w:pPr>
       <w:r>
-        <w:t>Suggested reflection for review: Correct values alone do not prove that a linked list is correct. Reliable tests also check the reachable node count, head and tail references, final next reference, and object identities. These checks make structural mistakes visible even when printed values look reasonable.</w:t>
+        <w:t>Correct values alone do not prove that a linked list is correct. Reliable tests also check the reachable node count, head and tail references, final next reference, and object identities. These checks make structural mistakes visible even when printed values look reasonable.</w:t>
       </w:r>
     </w:p>
     <w:p>

</xml_diff>

<commit_message>
Clarify report answers and document actual Visual Studio debugging
</commit_message>
<xml_diff>
--- a/Linked_List_Project_Report.docx
+++ b/Linked_List_Project_Report.docx
@@ -103,7 +103,7 @@
         <w:spacing w:after="160"/>
       </w:pPr>
       <w:r>
-        <w:t xml:space="preserve">This project implements a singly linked list from an ADT, then extends it with SplitEvensOdds. The subclass partitions the existing nodes by parity, preserves their order, and leaves the source empty.</w:t>
+        <w:t>The project has two parts: building a singly linked list from an ADT and extending it with the SplitEvensOdds subclass. The subclass separates the original nodes into even and odd lists, keeps their order, and leaves the source list empty.</w:t>
       </w:r>
     </w:p>
     <w:p>
@@ -226,7 +226,7 @@
         <w:spacing w:after="160"/>
       </w:pPr>
       <w:r>
-        <w:t xml:space="preserve">consecutive matches in remove_all() require previous to stay on the last retained node.</w:t>
+        <w:t>Removing consecutive matches requires previous to stay on the last node kept in the list. Moving it forward after a removal could skip a match or break the links.</w:t>
       </w:r>
     </w:p>
     <w:p>
@@ -245,7 +245,7 @@
         <w:spacing w:after="160"/>
       </w:pPr>
       <w:r>
-        <w:t xml:space="preserve">The implementation advances previous only when retaining a node. test_remove_all_multiple_locations verifies five removals, correct remaining links and tail, and a subsequent append.</w:t>
+        <w:t>The code moves previous forward only when keeping a node. The duplicate-removal test checks matches at the beginning, middle, and end, then appends another value to confirm that the tail is still correct.</w:t>
       </w:r>
     </w:p>
     <w:p>
@@ -949,10 +949,7 @@
     </w:p>
     <w:p>
       <w:r>
-        <w:t xml:space="preserve">test_singly_linked_list.py and test_split_evens_odds.py ran 32 tests successfully. The consecutive-match test verifies an important invariant: previous remains the last retained node. Split tests also reject Node construction and prohibited operations.</w:t>
-      </w:r>
-      <w:r>
-        <w:t> Visual Studio Community 2026 Test Explorer also passed all 32 tests using Python 3.12.14, with 0 failed, 0 skipped, 0 warnings, and 0 errors. The demonstration produced the same 15 expected lines inside Visual Studio.</w:t>
+        <w:t>The test modules are test_singly_linked_list.py and test_split_evens_odds.py. Visual Studio Test Explorer passed all 32 tests with Python 3.12.14: 0 failed, 0 skipped, 0 warnings, and 0 errors. The consecutive-match test was useful for checking that remove_all() keeps the links and tail correct. The split tests also confirm that the original node objects are reused.</w:t>
       </w:r>
     </w:p>
     <w:p/>
@@ -1001,7 +998,7 @@
     </w:p>
     <w:p>
       <w:r>
-        <w:t xml:space="preserve">The output shows forward construction, stable partitioning, an emptied source, and a handled missing-value error. All 15 full demonstration lines matched independently specified expected output. Full logs are in evidence/.</w:t>
+        <w:t>The output shows forward construction, the even and odd results in their original order, an empty source list, and a handled error. All 15 demonstration lines matched the expected output.</w:t>
       </w:r>
     </w:p>
     <w:p/>
@@ -1029,7 +1026,7 @@
         <w:spacing w:after="160"/>
       </w:pPr>
       <w:r>
-        <w:t xml:space="preserve">Each successful split test checks ordered values, reachable count, exact tail identity, tail.next, and empty source state. assertIs compares original and result node objects in order. Identity sets are disjoint and their union equals all original nodes. Constructor guards reject replacement nodes.</w:t>
+        <w:t>The tests compare the values and order in both results, check their counts and tails, and confirm that the source has no nodes left. They use assertIs to compare each result node with its original node. They also check that no node appears in both results and that no original node is missing.</w:t>
       </w:r>
     </w:p>
     <w:p>
@@ -1284,7 +1281,7 @@
         <w:spacing w:after="160"/>
       </w:pPr>
       <w:r>
-        <w:t>remove_all() must handle consecutive matching nodes without skipping a match or leaving an incorrect tail. The solution keeps previous on the last retained node and saves next_node before detaching current. The test with [2, 2, 1, 2, 3, 2, 2] removes five matches, checks the remaining [1, 3], and then appends 4 to verify the tail.</w:t>
+        <w:t>One problem was that Visual Studio timed out while discovering tests with Python 3.14. The Tests Output pane showed that discovery had timed out before any tests ran. Selecting Python 3.12 fixed the problem: Visual Studio found all 32 tests and completed a passing run. A later repeat missed the finish notification, so the tests were run again; that run finished with 32 passed and no warnings or errors.</w:t>
       </w:r>
     </w:p>
     <w:p>

</xml_diff>